<commit_message>
included quality interpretation analysis and corrections
</commit_message>
<xml_diff>
--- a/RNAseq/Expresion_diferencial/EdgeR/Plots/interpretación de graficos.docx
+++ b/RNAseq/Expresion_diferencial/EdgeR/Plots/interpretación de graficos.docx
@@ -1,9 +1,10 @@
 
 <file path=word/document.xml><?xml version="1.0" encoding="utf-8"?>
-<w:document xmlns:wpc="http://schemas.microsoft.com/office/word/2010/wordprocessingCanvas" xmlns:cx="http://schemas.microsoft.com/office/drawing/2014/chartex" xmlns:cx1="http://schemas.microsoft.com/office/drawing/2015/9/8/chartex" xmlns:cx2="http://schemas.microsoft.com/office/drawing/2015/10/21/chartex" xmlns:cx3="http://schemas.microsoft.com/office/drawing/2016/5/9/chartex" xmlns:cx4="http://schemas.microsoft.com/office/drawing/2016/5/10/chartex" xmlns:cx5="http://schemas.microsoft.com/office/drawing/2016/5/11/chartex" xmlns:cx6="http://schemas.microsoft.com/office/drawing/2016/5/12/chartex" xmlns:cx7="http://schemas.microsoft.com/office/drawing/2016/5/13/chartex" xmlns:cx8="http://schemas.microsoft.com/office/drawing/2016/5/14/chartex" xmlns:mc="http://schemas.openxmlformats.org/markup-compatibility/2006" xmlns:aink="http://schemas.microsoft.com/office/drawing/2016/ink" xmlns:am3d="http://schemas.microsoft.com/office/drawing/2017/model3d" xmlns:o="urn:schemas-microsoft-com:office:office" xmlns:oel="http://schemas.microsoft.com/office/2019/extlst" xmlns:r="http://schemas.openxmlformats.org/officeDocument/2006/relationships" xmlns:m="http://schemas.openxmlformats.org/officeDocument/2006/math" xmlns:v="urn:schemas-microsoft-com:vml" xmlns:wp14="http://schemas.microsoft.com/office/word/2010/wordprocessingDrawing" xmlns:wp="http://schemas.openxmlformats.org/drawingml/2006/wordprocessingDrawing" xmlns:w10="urn:schemas-microsoft-com:office:word" xmlns:w="http://schemas.openxmlformats.org/wordprocessingml/2006/main" xmlns:w14="http://schemas.microsoft.com/office/word/2010/wordml" xmlns:w15="http://schemas.microsoft.com/office/word/2012/wordml" xmlns:w16cex="http://schemas.microsoft.com/office/word/2018/wordml/cex" xmlns:w16cid="http://schemas.microsoft.com/office/word/2016/wordml/cid" xmlns:w16="http://schemas.microsoft.com/office/word/2018/wordml" xmlns:w16du="http://schemas.microsoft.com/office/word/2023/wordml/word16du" xmlns:w16sdtdh="http://schemas.microsoft.com/office/word/2020/wordml/sdtdatahash" xmlns:w16sdtfl="http://schemas.microsoft.com/office/word/2024/wordml/sdtformatlock" xmlns:w16se="http://schemas.microsoft.com/office/word/2015/wordml/symex" xmlns:wpg="http://schemas.microsoft.com/office/word/2010/wordprocessingGroup" xmlns:wpi="http://schemas.microsoft.com/office/word/2010/wordprocessingInk" xmlns:wne="http://schemas.microsoft.com/office/word/2006/wordml" xmlns:wps="http://schemas.microsoft.com/office/word/2010/wordprocessingShape" mc:Ignorable="w14 w15 w16se w16cid w16 w16cex w16sdtdh w16sdtfl w16du wp14">
+<w:document xmlns:wpc="http://schemas.microsoft.com/office/word/2010/wordprocessingCanvas" xmlns:cx="http://schemas.microsoft.com/office/drawing/2014/chartex" xmlns:cx1="http://schemas.microsoft.com/office/drawing/2015/9/8/chartex" xmlns:cx2="http://schemas.microsoft.com/office/drawing/2015/10/21/chartex" xmlns:cx3="http://schemas.microsoft.com/office/drawing/2016/5/9/chartex" xmlns:cx4="http://schemas.microsoft.com/office/drawing/2016/5/10/chartex" xmlns:cx5="http://schemas.microsoft.com/office/drawing/2016/5/11/chartex" xmlns:cx6="http://schemas.microsoft.com/office/drawing/2016/5/12/chartex" xmlns:cx7="http://schemas.microsoft.com/office/drawing/2016/5/13/chartex" xmlns:cx8="http://schemas.microsoft.com/office/drawing/2016/5/14/chartex" xmlns:mc="http://schemas.openxmlformats.org/markup-compatibility/2006" xmlns:aink="http://schemas.microsoft.com/office/drawing/2016/ink" xmlns:am3d="http://schemas.microsoft.com/office/drawing/2017/model3d" xmlns:o="urn:schemas-microsoft-com:office:office" xmlns:r="http://schemas.openxmlformats.org/officeDocument/2006/relationships" xmlns:m="http://schemas.openxmlformats.org/officeDocument/2006/math" xmlns:v="urn:schemas-microsoft-com:vml" xmlns:wp14="http://schemas.microsoft.com/office/word/2010/wordprocessingDrawing" xmlns:wp="http://schemas.openxmlformats.org/drawingml/2006/wordprocessingDrawing" xmlns:w10="urn:schemas-microsoft-com:office:word" xmlns:w="http://schemas.openxmlformats.org/wordprocessingml/2006/main" xmlns:w14="http://schemas.microsoft.com/office/word/2010/wordml" xmlns:w15="http://schemas.microsoft.com/office/word/2012/wordml" xmlns:w16cex="http://schemas.microsoft.com/office/word/2018/wordml/cex" xmlns:w16cid="http://schemas.microsoft.com/office/word/2016/wordml/cid" xmlns:w16="http://schemas.microsoft.com/office/word/2018/wordml" xmlns:w16se="http://schemas.microsoft.com/office/word/2015/wordml/symex" xmlns:wpg="http://schemas.microsoft.com/office/word/2010/wordprocessingGroup" xmlns:wpi="http://schemas.microsoft.com/office/word/2010/wordprocessingInk" xmlns:wne="http://schemas.microsoft.com/office/word/2006/wordml" xmlns:wps="http://schemas.microsoft.com/office/word/2010/wordprocessingShape" mc:Ignorable="w14 w15 w16se w16cid w16 w16cex wp14">
   <w:body>
     <w:p>
       <w:pPr>
+        <w:jc w:val="both"/>
         <w:rPr>
           <w:b/>
           <w:bCs/>
@@ -23,6 +24,7 @@
     </w:p>
     <w:p>
       <w:pPr>
+        <w:jc w:val="both"/>
         <w:rPr>
           <w:b/>
           <w:bCs/>
@@ -50,6 +52,9 @@
       </w:r>
     </w:p>
     <w:p>
+      <w:pPr>
+        <w:jc w:val="both"/>
+      </w:pPr>
       <w:r>
         <w:t xml:space="preserve">El primer panel del informe </w:t>
       </w:r>
@@ -82,25 +87,16 @@
         <w:t xml:space="preserve"> </w:t>
       </w:r>
       <w:r>
-        <w:t>Todas las muestras (Bart, Lisa, Maggie, Marge, Patty y Selma) presentan un recuento de 46.0 millones de lecturas</w:t>
-      </w:r>
-      <w:r>
-        <w:t xml:space="preserve"> </w:t>
-      </w:r>
-      <w:r>
-        <w:t xml:space="preserve">de 46.0 millones de lecturas por </w:t>
-      </w:r>
-      <w:r>
-        <w:t xml:space="preserve">cada </w:t>
-      </w:r>
-      <w:r>
-        <w:t xml:space="preserve">muestra, un valor </w:t>
-      </w:r>
-      <w:r>
-        <w:t xml:space="preserve">poco frecuente en </w:t>
-      </w:r>
-      <w:r>
-        <w:t>estudios de expresión</w:t>
+        <w:t xml:space="preserve">Todas las muestras (Bart, Lisa, Maggie, Marge, Patty y Selma) presentan un </w:t>
+      </w:r>
+      <w:r>
+        <w:rPr>
+          <w:highlight w:val="red"/>
+        </w:rPr>
+        <w:t>recuento de 46.0 millones de lecturas de 46.0 millones de lecturas por cada muestra</w:t>
+      </w:r>
+      <w:r>
+        <w:t>, un valor poco frecuente en estudios de expresión</w:t>
       </w:r>
       <w:r>
         <w:t xml:space="preserve"> diferencial</w:t>
@@ -134,6 +130,9 @@
       </w:r>
     </w:p>
     <w:p>
+      <w:pPr>
+        <w:jc w:val="both"/>
+      </w:pPr>
       <w:r>
         <w:t>Los valores de calidad se mantienen en la "zona verde" (</w:t>
       </w:r>
@@ -143,7 +142,16 @@
       </w:r>
       <w:proofErr w:type="spellEnd"/>
       <w:r>
-        <w:t xml:space="preserve"> &gt; 30) desde el inicio hasta el final de las lecturas de 50 </w:t>
+        <w:t xml:space="preserve"> &gt; 30) desde el inicio hasta el final de las lecturas de </w:t>
+      </w:r>
+      <w:r>
+        <w:rPr>
+          <w:highlight w:val="red"/>
+        </w:rPr>
+        <w:t>1</w:t>
+      </w:r>
+      <w:r>
+        <w:t xml:space="preserve">50 </w:t>
       </w:r>
       <w:proofErr w:type="spellStart"/>
       <w:r>
@@ -158,11 +166,26 @@
       </w:r>
     </w:p>
     <w:p>
-      <w:r>
-        <w:t>En el caso de este ejercicio, donde las secuencias fueron creadas computacionalmente, tiene sentido que la calidad, las lecturas y todos los parámetros tengan muy buenos valores. A la vez, se entiende que debido a esto no se observe</w:t>
-      </w:r>
-      <w:r>
-        <w:t xml:space="preserve"> la degradación típica de calidad hacia el final de la lectura que suele obligar al </w:t>
+      <w:pPr>
+        <w:jc w:val="both"/>
+      </w:pPr>
+      <w:r>
+        <w:t xml:space="preserve">En el caso de este ejercicio, donde las secuencias fueron creadas </w:t>
+      </w:r>
+      <w:r>
+        <w:t xml:space="preserve">artificialmente de manera </w:t>
+      </w:r>
+      <w:r>
+        <w:t>computacional, tiene sentido que la calidad, las lecturas y todos los parámetros tengan muy buenos valores. A la vez, se entiende que debido a esto no se observe</w:t>
+      </w:r>
+      <w:r>
+        <w:t xml:space="preserve"> la degradación típica de calidad hacia el final de la lectura que suele obligar a</w:t>
+      </w:r>
+      <w:r>
+        <w:t xml:space="preserve"> realizar un paso</w:t>
+      </w:r>
+      <w:r>
+        <w:t xml:space="preserve"> </w:t>
       </w:r>
       <w:proofErr w:type="spellStart"/>
       <w:r>
@@ -174,10 +197,25 @@
       </w:r>
       <w:proofErr w:type="spellEnd"/>
       <w:r>
-        <w:t>, lo que justifica el uso de las secuencias íntegras para el mapeo.</w:t>
+        <w:t xml:space="preserve">, lo que justifica el uso de las secuencias </w:t>
+      </w:r>
+      <w:r>
+        <w:t>de las lecturas crudas</w:t>
+      </w:r>
+      <w:r>
+        <w:t xml:space="preserve"> para el </w:t>
+      </w:r>
+      <w:r>
+        <w:t>alineamiento posterior</w:t>
+      </w:r>
+      <w:r>
+        <w:t>.</w:t>
       </w:r>
     </w:p>
     <w:p>
+      <w:pPr>
+        <w:jc w:val="both"/>
+      </w:pPr>
       <w:r>
         <w:t>Respecto a</w:t>
       </w:r>
@@ -216,36 +254,52 @@
       </w:r>
     </w:p>
     <w:p>
+      <w:pPr>
+        <w:jc w:val="both"/>
+      </w:pPr>
       <w:r>
         <w:t xml:space="preserve">El informe detecta la presencia </w:t>
       </w:r>
       <w:r>
-        <w:t xml:space="preserve">significativa de secuencias contaminantes provenientes de adaptadores de secuenciación. Los niveles de contenido de adaptadores oscilaron entre el 10.3% en la muestra de Marge Simpson y el 17.4% en la de Lisa Simpson. </w:t>
-      </w:r>
-      <w:r>
-        <w:t xml:space="preserve">Con el filtrado se logra </w:t>
-      </w:r>
-      <w:r>
-        <w:t>un valor residual del 0.0% en todas las muestras procesadas.</w:t>
+        <w:t xml:space="preserve">significativa de secuencias contaminantes provenientes de adaptadores de secuenciación. </w:t>
+      </w:r>
+      <w:r>
+        <w:rPr>
+          <w:highlight w:val="red"/>
+        </w:rPr>
+        <w:t xml:space="preserve">Los niveles de contenido de adaptadores oscilaron entre el 10.3% en la muestra de Marge Simpson y el 17.4% en la de Lisa Simpson. </w:t>
+      </w:r>
+      <w:r>
+        <w:rPr>
+          <w:highlight w:val="red"/>
+        </w:rPr>
+        <w:t>Con el filtrado se logra un valor residual del 0.0% en todas las muestras procesadas.</w:t>
       </w:r>
     </w:p>
     <w:p>
+      <w:pPr>
+        <w:jc w:val="both"/>
+      </w:pPr>
       <w:r>
         <w:t>Si este estudio fuera real</w:t>
       </w:r>
       <w:r>
-        <w:t xml:space="preserve">, el uso de datos crudos cuando la calidad es óptima </w:t>
-      </w:r>
-      <w:proofErr w:type="spellStart"/>
-      <w:r>
-        <w:t>evita</w:t>
-      </w:r>
-      <w:r>
-        <w:t>ria</w:t>
-      </w:r>
-      <w:proofErr w:type="spellEnd"/>
+        <w:t>, el uso de datos crudos cuando la calidad es óptima evita</w:t>
+      </w:r>
+      <w:r>
+        <w:t>r</w:t>
+      </w:r>
+      <w:r>
+        <w:t>í</w:t>
+      </w:r>
+      <w:r>
+        <w:t>a</w:t>
+      </w:r>
       <w:r>
         <w:t xml:space="preserve"> la pérdida innecesaria de información biológica que a veces ocurre durante el </w:t>
+      </w:r>
+      <w:r>
+        <w:t xml:space="preserve">proceso de </w:t>
       </w:r>
       <w:proofErr w:type="spellStart"/>
       <w:r>
@@ -260,21 +314,19 @@
         <w:t xml:space="preserve"> excesivo.</w:t>
       </w:r>
       <w:r>
-        <w:t xml:space="preserve"> En general se acostumbra a filtrar para </w:t>
-      </w:r>
-      <w:proofErr w:type="spellStart"/>
-      <w:r>
-        <w:t>obteren</w:t>
-      </w:r>
-      <w:proofErr w:type="spellEnd"/>
-      <w:r>
-        <w:t xml:space="preserve"> mejor calidad de secuencia, pero la calidad inicial ya era muy buena y, por tanto, se ha</w:t>
+        <w:t xml:space="preserve"> En general se acostumbra a filtrar para obte</w:t>
       </w:r>
       <w:r>
         <w:t>n</w:t>
       </w:r>
       <w:r>
-        <w:t xml:space="preserve"> decidido </w:t>
+        <w:t>e</w:t>
+      </w:r>
+      <w:r>
+        <w:t>r</w:t>
+      </w:r>
+      <w:r>
+        <w:t xml:space="preserve"> mejor calidad de secuencia, pero la calidad inicial ya era muy buena y, por tanto, se ha decidido </w:t>
       </w:r>
       <w:r>
         <w:t>usar los datos crudos en vez de los filtrados.</w:t>
@@ -285,6 +337,9 @@
         <w:jc w:val="center"/>
       </w:pPr>
       <w:r>
+        <w:rPr>
+          <w:noProof/>
+        </w:rPr>
         <w:drawing>
           <wp:inline distT="0" distB="0" distL="0" distR="0" wp14:anchorId="43972AEF" wp14:editId="32EE6188">
             <wp:extent cx="4038962" cy="2019481"/>
@@ -335,9 +390,14 @@
         </w:drawing>
       </w:r>
     </w:p>
-    <w:p/>
     <w:p>
       <w:pPr>
+        <w:jc w:val="both"/>
+      </w:pPr>
+    </w:p>
+    <w:p>
+      <w:pPr>
+        <w:jc w:val="both"/>
         <w:rPr>
           <w:b/>
           <w:bCs/>
@@ -376,6 +436,9 @@
       </w:r>
     </w:p>
     <w:p>
+      <w:pPr>
+        <w:jc w:val="both"/>
+      </w:pPr>
       <w:r>
         <w:t>El informe refleja una</w:t>
       </w:r>
@@ -387,6 +450,9 @@
       </w:r>
     </w:p>
     <w:p>
+      <w:pPr>
+        <w:jc w:val="both"/>
+      </w:pPr>
       <w:r>
         <w:t>T</w:t>
       </w:r>
@@ -394,15 +460,7 @@
         <w:t xml:space="preserve">odas las muestras presentan una tasa de alineamiento extremadamente alta, situándose </w:t>
       </w:r>
       <w:r>
-        <w:t xml:space="preserve">en </w:t>
-      </w:r>
-      <w:proofErr w:type="spellStart"/>
-      <w:r>
-        <w:t>el</w:t>
-      </w:r>
-      <w:proofErr w:type="spellEnd"/>
-      <w:r>
-        <w:t xml:space="preserve"> 100</w:t>
+        <w:t>en el 100</w:t>
       </w:r>
       <w:r>
         <w:t>%</w:t>
@@ -411,7 +469,16 @@
         <w:t>; d</w:t>
       </w:r>
       <w:r>
-        <w:t xml:space="preserve">e los 46 millones de fragmentos iniciales, </w:t>
+        <w:t xml:space="preserve">e </w:t>
+      </w:r>
+      <w:r>
+        <w:rPr>
+          <w:highlight w:val="red"/>
+        </w:rPr>
+        <w:t>los 46 millones de fragmentos iniciales</w:t>
+      </w:r>
+      <w:r>
+        <w:t xml:space="preserve">, </w:t>
       </w:r>
       <w:r>
         <w:t>todos</w:t>
@@ -423,26 +490,18 @@
         <w:t xml:space="preserve"> </w:t>
       </w:r>
       <w:r>
-        <w:t>En experimentos de RNA-</w:t>
-      </w:r>
-      <w:proofErr w:type="spellStart"/>
-      <w:r>
-        <w:t>seq</w:t>
-      </w:r>
-      <w:proofErr w:type="spellEnd"/>
-      <w:r>
-        <w:t>, una tasa superior al 80% se considera muy buena; alcanzar casi el 99% es un resultado excepcional. Esto indica que prácticamente la totalidad de las 46 millones de lecturas por muestra coinciden con secuencias del transcriptoma de referencia.</w:t>
+        <w:t>En experimentos de RNA-seq, una tasa superior al 80% se considera muy buena; alcanzar casi el 99% es un resultado excepcional. Esto indica que prácticamente la totalidad de las 46 millones de lecturas por muestra coinciden con secuencias del transcriptoma de referencia.</w:t>
       </w:r>
       <w:r>
         <w:t xml:space="preserve"> </w:t>
       </w:r>
     </w:p>
     <w:p>
-      <w:r>
-        <w:t>Además, e</w:t>
-      </w:r>
-      <w:r>
-        <w:t>sta cifra tan alta demuestra que la presencia de adaptadores (que vimos en el informe anterior) no impidió que Salmon identificara los genes correctamente</w:t>
+      <w:pPr>
+        <w:jc w:val="both"/>
+      </w:pPr>
+      <w:r>
+        <w:t>Además, esta cifra tan alta demuestra que la presencia de adaptadores (que vimos en el informe anterior) no impidió que Salmon identificara los genes correctamente</w:t>
       </w:r>
       <w:r>
         <w:t>. Esto pasa probablemente</w:t>
@@ -467,6 +526,9 @@
       </w:r>
     </w:p>
     <w:p>
+      <w:pPr>
+        <w:jc w:val="both"/>
+      </w:pPr>
       <w:r>
         <w:t xml:space="preserve">El </w:t>
       </w:r>
@@ -475,6 +537,7 @@
         <w:rPr>
           <w:i/>
           <w:iCs/>
+          <w:highlight w:val="red"/>
         </w:rPr>
         <w:t>Computed</w:t>
       </w:r>
@@ -483,6 +546,7 @@
         <w:rPr>
           <w:i/>
           <w:iCs/>
+          <w:highlight w:val="red"/>
         </w:rPr>
         <w:t xml:space="preserve"> </w:t>
       </w:r>
@@ -491,6 +555,7 @@
         <w:rPr>
           <w:i/>
           <w:iCs/>
+          <w:highlight w:val="red"/>
         </w:rPr>
         <w:t>Fragment</w:t>
       </w:r>
@@ -499,6 +564,7 @@
         <w:rPr>
           <w:i/>
           <w:iCs/>
+          <w:highlight w:val="red"/>
         </w:rPr>
         <w:t xml:space="preserve"> Ratio</w:t>
       </w:r>
@@ -506,10 +572,16 @@
         <w:t xml:space="preserve"> tiene u</w:t>
       </w:r>
       <w:r>
-        <w:t>n valor de 1.0</w:t>
-      </w:r>
-      <w:r>
-        <w:t>, lo cual indic</w:t>
+        <w:t xml:space="preserve">n valor de </w:t>
+      </w:r>
+      <w:r>
+        <w:rPr>
+          <w:highlight w:val="red"/>
+        </w:rPr>
+        <w:t>1.0,</w:t>
+      </w:r>
+      <w:r>
+        <w:t xml:space="preserve"> lo cual indic</w:t>
       </w:r>
       <w:r>
         <w:t>a que el número de fragmentos que Salmon esperaba observar coincide exactamente con lo que observó. Es un indicador de consistencia perfecta.</w:t>
@@ -1646,14 +1718,22 @@
         <w:jc w:val="both"/>
       </w:pPr>
     </w:p>
-    <w:p/>
     <w:p>
-      <w:r>
-        <w:br w:type="page"/>
-      </w:r>
+      <w:pPr>
+        <w:jc w:val="both"/>
+      </w:pPr>
     </w:p>
     <w:p>
       <w:pPr>
+        <w:jc w:val="both"/>
+      </w:pPr>
+      <w:r>
+        <w:br w:type="page"/>
+      </w:r>
+    </w:p>
+    <w:p>
+      <w:pPr>
+        <w:jc w:val="both"/>
         <w:rPr>
           <w:b/>
           <w:bCs/>
@@ -1684,6 +1764,9 @@
       <w:proofErr w:type="spellEnd"/>
     </w:p>
     <w:p>
+      <w:pPr>
+        <w:jc w:val="both"/>
+      </w:pPr>
       <w:r>
         <w:t xml:space="preserve">El </w:t>
       </w:r>
@@ -1725,6 +1808,9 @@
       </w:r>
     </w:p>
     <w:p>
+      <w:pPr>
+        <w:jc w:val="both"/>
+      </w:pPr>
       <w:r>
         <w:t xml:space="preserve">En general, se observan patrones opuestos de expresión entre ambos grupos. Varios genes presentan niveles relativamente bajos de expresión en individuos </w:t>
       </w:r>
@@ -1738,6 +1824,9 @@
       </w:r>
     </w:p>
     <w:p>
+      <w:pPr>
+        <w:jc w:val="both"/>
+      </w:pPr>
       <w:r>
         <w:t xml:space="preserve">Entre los genes con mayor expresión en el grupo con sobrepeso/obesidad se encuentran </w:t>
       </w:r>
@@ -1782,15 +1871,7 @@
         <w:t xml:space="preserve">, genes que </w:t>
       </w:r>
       <w:r>
-        <w:t xml:space="preserve">controlan el balance energético y el almacenamiento de energía. </w:t>
-      </w:r>
-      <w:proofErr w:type="spellStart"/>
-      <w:r>
-        <w:t>Por</w:t>
-      </w:r>
-      <w:proofErr w:type="spellEnd"/>
-      <w:r>
-        <w:t xml:space="preserve"> el contrario, genes como </w:t>
+        <w:t xml:space="preserve">controlan el balance energético y el almacenamiento de energía. Por el contrario, genes como </w:t>
       </w:r>
       <w:r>
         <w:rPr>
@@ -1832,6 +1913,9 @@
       </w:r>
     </w:p>
     <w:p>
+      <w:pPr>
+        <w:jc w:val="both"/>
+      </w:pPr>
       <w:r>
         <w:t xml:space="preserve">El agrupamiento de los genes indica además que estos no actúan de manera aislada, sino que forman conjuntos con patrones de expresión similares, lo que sugiere la participación de vías biológicas comunes. Las variables demográficas incluidas, como la edad y el sexo, no parecen ser los principales determinantes del patrón de agrupamiento observado, ya que la separación entre muestras está dominada por la condición de </w:t>
       </w:r>
@@ -1845,6 +1929,9 @@
       </w:r>
     </w:p>
     <w:p>
+      <w:pPr>
+        <w:jc w:val="both"/>
+      </w:pPr>
       <w:r>
         <w:t>En conjunto, estos resultados apoyan la idea de que la obesidad tipo 2 se asocia con cambios específicos y coordinados en la expresión génica</w:t>
       </w:r>
@@ -1853,12 +1940,16 @@
       </w:r>
     </w:p>
     <w:p>
+      <w:pPr>
+        <w:jc w:val="both"/>
+      </w:pPr>
       <w:r>
         <w:br w:type="page"/>
       </w:r>
     </w:p>
     <w:p>
       <w:pPr>
+        <w:jc w:val="both"/>
         <w:rPr>
           <w:b/>
           <w:bCs/>
@@ -1874,8 +1965,9 @@
           <w:szCs w:val="24"/>
         </w:rPr>
         <w:lastRenderedPageBreak/>
-        <w:t>4</w:t>
-      </w:r>
+        <w:t xml:space="preserve">4. </w:t>
+      </w:r>
+      <w:proofErr w:type="spellStart"/>
       <w:r>
         <w:rPr>
           <w:b/>
@@ -1883,314 +1975,515 @@
           <w:sz w:val="24"/>
           <w:szCs w:val="24"/>
         </w:rPr>
-        <w:t xml:space="preserve">. </w:t>
+        <w:t>Volcanoplot</w:t>
+      </w:r>
+      <w:proofErr w:type="spellEnd"/>
+    </w:p>
+    <w:p>
+      <w:pPr>
+        <w:jc w:val="both"/>
+      </w:pPr>
+      <w:r>
+        <w:t xml:space="preserve">El gráfico muestra la relación entre el cambio en la expresión génica (log₂ </w:t>
       </w:r>
       <w:proofErr w:type="spellStart"/>
       <w:r>
+        <w:t>fold</w:t>
+      </w:r>
+      <w:proofErr w:type="spellEnd"/>
+      <w:r>
+        <w:t xml:space="preserve"> </w:t>
+      </w:r>
+      <w:proofErr w:type="spellStart"/>
+      <w:r>
+        <w:t>change</w:t>
+      </w:r>
+      <w:proofErr w:type="spellEnd"/>
+      <w:r>
+        <w:t>) y la significancia estadística (–log₁₀ FDR) para los genes analizados. Este tipo de gráfico permite identificar de forma visual aquellos genes que presentan cambios de expresión relevantes y estadísticamente significativos entre los grupos comparados.</w:t>
+      </w:r>
+    </w:p>
+    <w:p>
+      <w:pPr>
+        <w:jc w:val="both"/>
+        <w:rPr>
+          <w:i/>
+          <w:iCs/>
+          <w:color w:val="A6A6A6" w:themeColor="background1" w:themeShade="A6"/>
+        </w:rPr>
+      </w:pPr>
+      <w:r>
+        <w:rPr>
+          <w:i/>
+          <w:iCs/>
+          <w:color w:val="A6A6A6" w:themeColor="background1" w:themeShade="A6"/>
+        </w:rPr>
+        <w:t xml:space="preserve">En el eje horizontal se observa el grado de sobreexpresión o </w:t>
+      </w:r>
+      <w:proofErr w:type="spellStart"/>
+      <w:r>
+        <w:rPr>
+          <w:i/>
+          <w:iCs/>
+          <w:color w:val="A6A6A6" w:themeColor="background1" w:themeShade="A6"/>
+        </w:rPr>
+        <w:t>infraexpresión</w:t>
+      </w:r>
+      <w:proofErr w:type="spellEnd"/>
+      <w:r>
+        <w:rPr>
+          <w:i/>
+          <w:iCs/>
+          <w:color w:val="A6A6A6" w:themeColor="background1" w:themeShade="A6"/>
+        </w:rPr>
+        <w:t xml:space="preserve"> de los genes en el grupo con sobrepeso/obesidad tipo 2 en comparación con el grupo </w:t>
+      </w:r>
+      <w:proofErr w:type="spellStart"/>
+      <w:r>
+        <w:rPr>
+          <w:i/>
+          <w:iCs/>
+          <w:color w:val="A6A6A6" w:themeColor="background1" w:themeShade="A6"/>
+        </w:rPr>
+        <w:t>normopeso</w:t>
+      </w:r>
+      <w:proofErr w:type="spellEnd"/>
+      <w:r>
+        <w:rPr>
+          <w:i/>
+          <w:iCs/>
+          <w:color w:val="A6A6A6" w:themeColor="background1" w:themeShade="A6"/>
+        </w:rPr>
+        <w:t>, mientras que el eje vertical representa el nivel de significancia estadística. Los genes resaltados en color corresponden a aquellos que superan los umbrales establecidos tanto para cambio de expresión como para significancia.</w:t>
+      </w:r>
+    </w:p>
+    <w:p>
+      <w:pPr>
+        <w:jc w:val="both"/>
+      </w:pPr>
+      <w:r>
+        <w:t xml:space="preserve">Los genes </w:t>
+      </w:r>
+      <w:proofErr w:type="spellStart"/>
+      <w:r>
+        <w:rPr>
+          <w:b/>
+          <w:bCs/>
+        </w:rPr>
+        <w:t>sobreexpresados</w:t>
+      </w:r>
+      <w:proofErr w:type="spellEnd"/>
+      <w:r>
+        <w:t xml:space="preserve"> en el grupo con sobrepeso/obesidad tipo 2, representados en rojo, incluyen </w:t>
+      </w:r>
+      <w:r>
+        <w:rPr>
+          <w:i/>
+          <w:iCs/>
+        </w:rPr>
+        <w:t>FTO</w:t>
+      </w:r>
+      <w:r>
+        <w:t xml:space="preserve">, </w:t>
+      </w:r>
+      <w:r>
+        <w:rPr>
+          <w:i/>
+          <w:iCs/>
+        </w:rPr>
+        <w:t>SIM1</w:t>
+      </w:r>
+      <w:r>
+        <w:t xml:space="preserve"> y </w:t>
+      </w:r>
+      <w:r>
+        <w:rPr>
+          <w:i/>
+          <w:iCs/>
+        </w:rPr>
+        <w:t>MC4R</w:t>
+      </w:r>
+      <w:r>
+        <w:t xml:space="preserve">, los cuales muestran valores positivos de log₂ </w:t>
+      </w:r>
+      <w:proofErr w:type="spellStart"/>
+      <w:r>
+        <w:t>fold</w:t>
+      </w:r>
+      <w:proofErr w:type="spellEnd"/>
+      <w:r>
+        <w:t xml:space="preserve"> </w:t>
+      </w:r>
+      <w:proofErr w:type="spellStart"/>
+      <w:r>
+        <w:t>change</w:t>
+      </w:r>
+      <w:proofErr w:type="spellEnd"/>
+      <w:r>
+        <w:t xml:space="preserve"> y alta significancia estadística. </w:t>
+      </w:r>
+      <w:r>
+        <w:t xml:space="preserve">Aparece también UBR2 que muestra mucha significancia estadística, pero su valor de expresión se encuentra un poco por debajo del límite de expresión génica para considerar-se sobreexpresión. Puede que se tenga que valorar modificar el limite. </w:t>
+      </w:r>
+    </w:p>
+    <w:p>
+      <w:pPr>
+        <w:jc w:val="both"/>
+      </w:pPr>
+      <w:r>
+        <w:t xml:space="preserve">Por otro lado, los genes </w:t>
+      </w:r>
+      <w:proofErr w:type="spellStart"/>
+      <w:r>
+        <w:rPr>
+          <w:b/>
+          <w:bCs/>
+        </w:rPr>
+        <w:t>infraexpresados</w:t>
+      </w:r>
+      <w:proofErr w:type="spellEnd"/>
+      <w:r>
+        <w:t xml:space="preserve"> en el grupo con sobrepeso/obesidad, mostrados en azul, incluyen </w:t>
+      </w:r>
+      <w:r>
+        <w:rPr>
+          <w:i/>
+          <w:iCs/>
+        </w:rPr>
+        <w:t>NTRK2</w:t>
+      </w:r>
+      <w:r>
+        <w:t xml:space="preserve"> y</w:t>
+      </w:r>
+      <w:r>
+        <w:t xml:space="preserve"> </w:t>
+      </w:r>
+      <w:r>
+        <w:rPr>
+          <w:i/>
+          <w:iCs/>
+        </w:rPr>
+        <w:t>LEP</w:t>
+      </w:r>
+      <w:r>
+        <w:t>. Estos genes presentan una menor expresión relativa en obesidad</w:t>
+      </w:r>
+      <w:r>
+        <w:t>. En este caso también observamos tres genes que tienen significación estadística, pero se encuentran por debajo del límite establecido para considerar disminución de la expresión</w:t>
+      </w:r>
+      <w:proofErr w:type="gramStart"/>
+      <w:r>
+        <w:t xml:space="preserve">: </w:t>
+      </w:r>
+      <w:r>
+        <w:t>,</w:t>
+      </w:r>
+      <w:proofErr w:type="gramEnd"/>
+      <w:r>
+        <w:t xml:space="preserve"> </w:t>
+      </w:r>
+      <w:r>
+        <w:rPr>
+          <w:i/>
+          <w:iCs/>
+        </w:rPr>
+        <w:t>UHMK1</w:t>
+      </w:r>
+      <w:r>
+        <w:t xml:space="preserve"> se encuentra en el límite y </w:t>
+      </w:r>
+      <w:r>
+        <w:rPr>
+          <w:i/>
+          <w:iCs/>
+        </w:rPr>
+        <w:t>BDNF</w:t>
+      </w:r>
+      <w:r>
+        <w:t xml:space="preserve"> y </w:t>
+      </w:r>
+      <w:r>
+        <w:rPr>
+          <w:i/>
+          <w:iCs/>
+        </w:rPr>
+        <w:t>CADM2</w:t>
+      </w:r>
+      <w:r>
+        <w:rPr>
+          <w:i/>
+          <w:iCs/>
+        </w:rPr>
+        <w:t xml:space="preserve"> </w:t>
+      </w:r>
+      <w:proofErr w:type="spellStart"/>
+      <w:r>
+        <w:t>estan</w:t>
+      </w:r>
+      <w:proofErr w:type="spellEnd"/>
+      <w:r>
+        <w:t xml:space="preserve"> muy cercanos.</w:t>
+      </w:r>
+    </w:p>
+    <w:p>
+      <w:pPr>
+        <w:jc w:val="both"/>
+      </w:pPr>
+      <w:r>
+        <w:t xml:space="preserve">En conjunto, el gráfico </w:t>
+      </w:r>
+      <w:proofErr w:type="spellStart"/>
+      <w:r>
+        <w:t>volcano</w:t>
+      </w:r>
+      <w:proofErr w:type="spellEnd"/>
+      <w:r>
+        <w:t xml:space="preserve"> evidencia un subconjunto de genes con cambios de expresión significativos entre </w:t>
+      </w:r>
+      <w:proofErr w:type="spellStart"/>
+      <w:r>
+        <w:t>normopeso</w:t>
+      </w:r>
+      <w:proofErr w:type="spellEnd"/>
+      <w:r>
+        <w:t xml:space="preserve"> y sobrepeso/obesidad tipo 2, destacando tanto genes activados como reprimidos en esta condición.</w:t>
+      </w:r>
+    </w:p>
+    <w:p>
+      <w:pPr>
+        <w:jc w:val="both"/>
+      </w:pPr>
+    </w:p>
+    <w:p>
+      <w:pPr>
+        <w:jc w:val="both"/>
+      </w:pPr>
+      <w:r>
+        <w:br w:type="page"/>
+      </w:r>
+    </w:p>
+    <w:p>
+      <w:pPr>
+        <w:jc w:val="both"/>
         <w:rPr>
           <w:b/>
           <w:bCs/>
           <w:sz w:val="24"/>
           <w:szCs w:val="24"/>
         </w:rPr>
-        <w:t>Volcanoplot</w:t>
-      </w:r>
-      <w:proofErr w:type="spellEnd"/>
-    </w:p>
-    <w:p>
-      <w:r>
-        <w:t xml:space="preserve">El gráfico muestra la relación entre el cambio en la expresión génica (log₂ </w:t>
-      </w:r>
-      <w:proofErr w:type="spellStart"/>
-      <w:r>
-        <w:t>fold</w:t>
-      </w:r>
-      <w:proofErr w:type="spellEnd"/>
-      <w:r>
-        <w:t xml:space="preserve"> </w:t>
-      </w:r>
-      <w:proofErr w:type="spellStart"/>
-      <w:r>
-        <w:t>change</w:t>
-      </w:r>
-      <w:proofErr w:type="spellEnd"/>
-      <w:r>
-        <w:t>) y la significancia estadística (–log₁₀ FDR) para los genes analizados. Este tipo de gráfico permite identificar de forma visual aquellos genes que presentan cambios de expresión relevantes y estadísticamente significativos entre los grupos comparados.</w:t>
-      </w:r>
-    </w:p>
-    <w:p>
-      <w:pPr>
-        <w:rPr>
-          <w:i/>
-          <w:iCs/>
-          <w:color w:val="A6A6A6" w:themeColor="background1" w:themeShade="A6"/>
-        </w:rPr>
-      </w:pPr>
-      <w:r>
-        <w:rPr>
-          <w:i/>
-          <w:iCs/>
-          <w:color w:val="A6A6A6" w:themeColor="background1" w:themeShade="A6"/>
-        </w:rPr>
-        <w:t xml:space="preserve">En el eje horizontal se observa el grado de sobreexpresión o </w:t>
-      </w:r>
-      <w:proofErr w:type="spellStart"/>
-      <w:r>
-        <w:rPr>
-          <w:i/>
-          <w:iCs/>
-          <w:color w:val="A6A6A6" w:themeColor="background1" w:themeShade="A6"/>
-        </w:rPr>
-        <w:t>infraexpresión</w:t>
-      </w:r>
-      <w:proofErr w:type="spellEnd"/>
-      <w:r>
-        <w:rPr>
-          <w:i/>
-          <w:iCs/>
-          <w:color w:val="A6A6A6" w:themeColor="background1" w:themeShade="A6"/>
-        </w:rPr>
-        <w:t xml:space="preserve"> de los genes en el grupo con sobrepeso/obesidad tipo 2 en comparación con el grupo </w:t>
-      </w:r>
-      <w:proofErr w:type="spellStart"/>
-      <w:r>
-        <w:rPr>
-          <w:i/>
-          <w:iCs/>
-          <w:color w:val="A6A6A6" w:themeColor="background1" w:themeShade="A6"/>
-        </w:rPr>
-        <w:t>normopeso</w:t>
-      </w:r>
-      <w:proofErr w:type="spellEnd"/>
-      <w:r>
-        <w:rPr>
-          <w:i/>
-          <w:iCs/>
-          <w:color w:val="A6A6A6" w:themeColor="background1" w:themeShade="A6"/>
-        </w:rPr>
-        <w:t>, mientras que el eje vertical representa el nivel de significancia estadística. Los genes resaltados en color corresponden a aquellos que superan los umbrales establecidos tanto para cambio de expresión como para significancia.</w:t>
-      </w:r>
-    </w:p>
-    <w:p>
-      <w:r>
-        <w:t xml:space="preserve">Los genes </w:t>
-      </w:r>
-      <w:proofErr w:type="spellStart"/>
-      <w:r>
-        <w:rPr>
-          <w:b/>
-          <w:bCs/>
-        </w:rPr>
-        <w:t>sobreexpresados</w:t>
-      </w:r>
-      <w:proofErr w:type="spellEnd"/>
-      <w:r>
-        <w:t xml:space="preserve"> en el grupo con sobrepeso/obesidad tipo 2, representados en rojo, incluyen </w:t>
-      </w:r>
-      <w:r>
-        <w:rPr>
-          <w:i/>
-          <w:iCs/>
-        </w:rPr>
-        <w:t>FTO</w:t>
-      </w:r>
-      <w:r>
-        <w:t xml:space="preserve">, </w:t>
-      </w:r>
-      <w:r>
-        <w:rPr>
-          <w:i/>
-          <w:iCs/>
-        </w:rPr>
-        <w:t>SIM1</w:t>
-      </w:r>
-      <w:r>
-        <w:t xml:space="preserve"> y </w:t>
-      </w:r>
-      <w:r>
-        <w:rPr>
-          <w:i/>
-          <w:iCs/>
-        </w:rPr>
-        <w:t>MC4R</w:t>
-      </w:r>
-      <w:r>
-        <w:t xml:space="preserve">, los cuales muestran valores positivos de log₂ </w:t>
-      </w:r>
-      <w:proofErr w:type="spellStart"/>
-      <w:r>
-        <w:t>fold</w:t>
-      </w:r>
-      <w:proofErr w:type="spellEnd"/>
-      <w:r>
-        <w:t xml:space="preserve"> </w:t>
-      </w:r>
-      <w:proofErr w:type="spellStart"/>
-      <w:r>
-        <w:t>change</w:t>
-      </w:r>
-      <w:proofErr w:type="spellEnd"/>
-      <w:r>
-        <w:t xml:space="preserve"> y alta significancia estadística. </w:t>
-      </w:r>
-      <w:r>
-        <w:t xml:space="preserve">Aparece también UBR2 que muestra mucha significancia estadística, pero su valor de expresión se encuentra un poco por debajo del límite de expresión génica para considerar-se sobreexpresión. Puede que se tenga que valorar modificar el </w:t>
-      </w:r>
-      <w:proofErr w:type="spellStart"/>
-      <w:r>
-        <w:t>limite</w:t>
-      </w:r>
-      <w:proofErr w:type="spellEnd"/>
-      <w:r>
-        <w:t xml:space="preserve">. </w:t>
-      </w:r>
-    </w:p>
-    <w:p>
-      <w:r>
-        <w:t xml:space="preserve">Por otro lado, los genes </w:t>
-      </w:r>
-      <w:proofErr w:type="spellStart"/>
-      <w:r>
-        <w:rPr>
-          <w:b/>
-          <w:bCs/>
-        </w:rPr>
-        <w:t>infraexpresados</w:t>
-      </w:r>
-      <w:proofErr w:type="spellEnd"/>
-      <w:r>
-        <w:t xml:space="preserve"> en el grupo con sobrepeso/obesidad, mostrados en azul, incluyen </w:t>
-      </w:r>
-      <w:r>
-        <w:rPr>
-          <w:i/>
-          <w:iCs/>
-        </w:rPr>
-        <w:t>NTRK2</w:t>
-      </w:r>
-      <w:r>
-        <w:t xml:space="preserve"> y</w:t>
-      </w:r>
-      <w:r>
-        <w:t xml:space="preserve"> </w:t>
-      </w:r>
-      <w:r>
-        <w:rPr>
-          <w:i/>
-          <w:iCs/>
-        </w:rPr>
-        <w:t>LEP</w:t>
-      </w:r>
-      <w:r>
-        <w:t>. Estos genes presentan una menor expresión relativa en obesidad</w:t>
-      </w:r>
-      <w:r>
-        <w:t xml:space="preserve">. En este caso también observamos tres genes que tienen significación estadística, pero se encuentran por debajo del límite establecido para considerar disminución de la expresión: </w:t>
-      </w:r>
-      <w:r>
-        <w:t xml:space="preserve">, </w:t>
-      </w:r>
-      <w:r>
-        <w:rPr>
-          <w:i/>
-          <w:iCs/>
-        </w:rPr>
-        <w:t>UHMK1</w:t>
-      </w:r>
-      <w:r>
-        <w:t xml:space="preserve"> se encuentra en el límite y </w:t>
-      </w:r>
-      <w:r>
-        <w:rPr>
-          <w:i/>
-          <w:iCs/>
-        </w:rPr>
-        <w:t>BDNF</w:t>
-      </w:r>
-      <w:r>
-        <w:t xml:space="preserve"> y </w:t>
-      </w:r>
-      <w:r>
-        <w:rPr>
-          <w:i/>
-          <w:iCs/>
-        </w:rPr>
-        <w:t>CADM2</w:t>
-      </w:r>
-      <w:r>
-        <w:rPr>
-          <w:i/>
-          <w:iCs/>
-        </w:rPr>
-        <w:t xml:space="preserve"> </w:t>
-      </w:r>
-      <w:proofErr w:type="spellStart"/>
-      <w:r>
-        <w:t>estan</w:t>
-      </w:r>
-      <w:proofErr w:type="spellEnd"/>
-      <w:r>
-        <w:t xml:space="preserve"> muy cercanos.</w:t>
-      </w:r>
-    </w:p>
-    <w:p>
-      <w:r>
-        <w:t xml:space="preserve">En conjunto, el gráfico </w:t>
-      </w:r>
-      <w:proofErr w:type="spellStart"/>
-      <w:r>
-        <w:t>volcano</w:t>
-      </w:r>
-      <w:proofErr w:type="spellEnd"/>
-      <w:r>
-        <w:t xml:space="preserve"> evidencia un subconjunto de genes con cambios de expresión significativos entre </w:t>
-      </w:r>
-      <w:proofErr w:type="spellStart"/>
-      <w:r>
-        <w:t>normopeso</w:t>
-      </w:r>
-      <w:proofErr w:type="spellEnd"/>
-      <w:r>
-        <w:t xml:space="preserve"> y sobrepeso/obesidad tipo 2, destacando tanto genes activados como reprimidos en esta condición.</w:t>
-      </w:r>
-    </w:p>
-    <w:p/>
-    <w:p>
-      <w:r>
-        <w:br w:type="page"/>
-      </w:r>
-    </w:p>
-    <w:p>
-      <w:pPr>
+      </w:pPr>
+      <w:r>
         <w:rPr>
           <w:b/>
           <w:bCs/>
           <w:sz w:val="24"/>
           <w:szCs w:val="24"/>
         </w:rPr>
-      </w:pPr>
+        <w:lastRenderedPageBreak/>
+        <w:t>2. Gráfico MA</w:t>
+      </w:r>
+    </w:p>
+    <w:p>
+      <w:pPr>
+        <w:jc w:val="both"/>
+      </w:pPr>
+      <w:r>
+        <w:t>El gráfico MA representa la relación entre el nivel promedio de expresión génica (</w:t>
+      </w:r>
+      <w:proofErr w:type="spellStart"/>
+      <w:r>
+        <w:t>average</w:t>
+      </w:r>
+      <w:proofErr w:type="spellEnd"/>
+      <w:r>
+        <w:t xml:space="preserve"> log CPM) y el cambio de expresión (log-</w:t>
+      </w:r>
+      <w:proofErr w:type="spellStart"/>
+      <w:r>
+        <w:t>fold</w:t>
+      </w:r>
+      <w:proofErr w:type="spellEnd"/>
+      <w:r>
+        <w:t xml:space="preserve"> </w:t>
+      </w:r>
+      <w:proofErr w:type="spellStart"/>
+      <w:r>
+        <w:t>change</w:t>
+      </w:r>
+      <w:proofErr w:type="spellEnd"/>
+      <w:r>
+        <w:t>) entre los grupos analizados. Este enfoque permite evaluar si los cambios observados dependen del nivel basal de expresión de los genes.</w:t>
+      </w:r>
+    </w:p>
+    <w:p>
+      <w:pPr>
+        <w:jc w:val="both"/>
+      </w:pPr>
+      <w:r>
+        <w:t>La mayoría de los genes se agrupan alrededor del valor cero en el eje vertical, lo que indica que no presentan cambios relevantes de expresión entre los grupos. Sin embargo, algunos genes se separan claramente de este patrón y muestran cambios consistentes y significativos.</w:t>
+      </w:r>
+    </w:p>
+    <w:p>
+      <w:pPr>
+        <w:jc w:val="both"/>
+      </w:pPr>
+      <w:r>
+        <w:t xml:space="preserve">Entre los genes </w:t>
+      </w:r>
+      <w:proofErr w:type="spellStart"/>
       <w:r>
         <w:rPr>
           <w:b/>
           <w:bCs/>
-          <w:sz w:val="24"/>
-          <w:szCs w:val="24"/>
-        </w:rPr>
-        <w:lastRenderedPageBreak/>
-        <w:t>2. Gráfico MA</w:t>
+        </w:rPr>
+        <w:t>sobreexpresados</w:t>
+      </w:r>
+      <w:proofErr w:type="spellEnd"/>
+      <w:r>
+        <w:t xml:space="preserve"> en el grupo con sobrepeso/obesidad tipo 2 destacan </w:t>
+      </w:r>
+      <w:r>
+        <w:rPr>
+          <w:i/>
+          <w:iCs/>
+        </w:rPr>
+        <w:t>FTO</w:t>
+      </w:r>
+      <w:r>
+        <w:t xml:space="preserve">, </w:t>
+      </w:r>
+      <w:r>
+        <w:rPr>
+          <w:i/>
+          <w:iCs/>
+        </w:rPr>
+        <w:t>SIM1</w:t>
+      </w:r>
+      <w:r>
+        <w:t xml:space="preserve">, </w:t>
+      </w:r>
+      <w:r>
+        <w:rPr>
+          <w:i/>
+          <w:iCs/>
+        </w:rPr>
+        <w:t>MC4R</w:t>
+      </w:r>
+      <w:r>
+        <w:t xml:space="preserve"> y </w:t>
+      </w:r>
+      <w:r>
+        <w:rPr>
+          <w:i/>
+          <w:iCs/>
+        </w:rPr>
+        <w:t>UBR2</w:t>
+      </w:r>
+      <w:r>
+        <w:t>, los cuales presentan valores positivos de log-</w:t>
+      </w:r>
+      <w:proofErr w:type="spellStart"/>
+      <w:r>
+        <w:t>fold</w:t>
+      </w:r>
+      <w:proofErr w:type="spellEnd"/>
+      <w:r>
+        <w:t xml:space="preserve"> </w:t>
+      </w:r>
+      <w:proofErr w:type="spellStart"/>
+      <w:r>
+        <w:t>change</w:t>
+      </w:r>
+      <w:proofErr w:type="spellEnd"/>
+      <w:r>
+        <w:t xml:space="preserve">, indicando un aumento de su expresión respecto al grupo </w:t>
+      </w:r>
+      <w:proofErr w:type="spellStart"/>
+      <w:r>
+        <w:t>normopeso</w:t>
+      </w:r>
+      <w:proofErr w:type="spellEnd"/>
+      <w:r>
+        <w:t>. Estos genes mantienen niveles de expresión promedio relativamente altos, lo que refuerza la robustez de los cambios observados.</w:t>
+      </w:r>
+      <w:r>
+        <w:t xml:space="preserve"> En este caso también vemos que UBR2 se queda por debajo del límite establecido aún ser estadísticamente significativo.  </w:t>
       </w:r>
     </w:p>
     <w:p>
-      <w:r>
-        <w:t>El gráfico MA representa la relación entre el nivel promedio de expresión génica (</w:t>
+      <w:pPr>
+        <w:jc w:val="both"/>
+      </w:pPr>
+      <w:r>
+        <w:t xml:space="preserve">En contraste, </w:t>
+      </w:r>
+      <w:r>
+        <w:t xml:space="preserve">los </w:t>
+      </w:r>
+      <w:r>
+        <w:t xml:space="preserve">genes </w:t>
+      </w:r>
+      <w:r>
+        <w:rPr>
+          <w:i/>
+          <w:iCs/>
+        </w:rPr>
+        <w:t>NTRK2</w:t>
+      </w:r>
+      <w:r>
+        <w:t xml:space="preserve">, </w:t>
+      </w:r>
+      <w:r>
+        <w:rPr>
+          <w:i/>
+          <w:iCs/>
+        </w:rPr>
+        <w:t>LEP</w:t>
+      </w:r>
+      <w:r>
+        <w:t xml:space="preserve">, </w:t>
+      </w:r>
+      <w:r>
+        <w:rPr>
+          <w:i/>
+          <w:iCs/>
+        </w:rPr>
+        <w:t>BDNF</w:t>
+      </w:r>
+      <w:r>
+        <w:t xml:space="preserve">, </w:t>
+      </w:r>
+      <w:r>
+        <w:rPr>
+          <w:i/>
+          <w:iCs/>
+        </w:rPr>
+        <w:t>CADM2</w:t>
+      </w:r>
+      <w:r>
+        <w:t xml:space="preserve"> y </w:t>
+      </w:r>
+      <w:r>
+        <w:rPr>
+          <w:i/>
+          <w:iCs/>
+        </w:rPr>
+        <w:t>UHMK1</w:t>
+      </w:r>
+      <w:r>
+        <w:t xml:space="preserve"> aparecen como </w:t>
       </w:r>
       <w:proofErr w:type="spellStart"/>
       <w:r>
-        <w:t>average</w:t>
+        <w:rPr>
+          <w:b/>
+          <w:bCs/>
+        </w:rPr>
+        <w:t>infraexpresados</w:t>
       </w:r>
       <w:proofErr w:type="spellEnd"/>
       <w:r>
-        <w:t xml:space="preserve"> log CPM) y el cambio de expresión (log-</w:t>
+        <w:t xml:space="preserve"> en el grupo con sobrepeso/obesidad, con valores negativos de log-</w:t>
       </w:r>
       <w:proofErr w:type="spellStart"/>
       <w:r>
@@ -2206,201 +2499,30 @@
       </w:r>
       <w:proofErr w:type="spellEnd"/>
       <w:r>
-        <w:t>) entre los grupos analizados. Este enfoque permite evaluar si los cambios observados dependen del nivel basal de expresión de los genes.</w:t>
+        <w:t>. La disminución de su expresión es consistente a lo largo de diferentes niveles de expresión promedio, lo que sugiere que estos cambios no son producto de variaciones técnicas, sino de diferencias biológicas reales entre los grupos.</w:t>
       </w:r>
     </w:p>
     <w:p>
-      <w:r>
-        <w:t>La mayoría de los genes se agrupan alrededor del valor cero en el eje vertical, lo que indica que no presentan cambios relevantes de expresión entre los grupos. Sin embargo, algunos genes se separan claramente de este patrón y muestran cambios consistentes y significativos.</w:t>
+      <w:pPr>
+        <w:jc w:val="both"/>
+      </w:pPr>
+      <w:r>
+        <w:t xml:space="preserve">En general, el gráfico MA confirma los resultados observados en el gráfico </w:t>
+      </w:r>
+      <w:proofErr w:type="spellStart"/>
+      <w:r>
+        <w:t>volcano</w:t>
+      </w:r>
+      <w:proofErr w:type="spellEnd"/>
+      <w:r>
+        <w:t>, mostrando que un número reducido pero relevante de genes presenta cambios de expresión claros y reproducibles asociados al estado de sobrepeso/obesidad tipo 2.</w:t>
       </w:r>
     </w:p>
     <w:p>
-      <w:r>
-        <w:t xml:space="preserve">Entre los genes </w:t>
-      </w:r>
-      <w:proofErr w:type="spellStart"/>
-      <w:r>
-        <w:rPr>
-          <w:b/>
-          <w:bCs/>
-        </w:rPr>
-        <w:t>sobreexpresados</w:t>
-      </w:r>
-      <w:proofErr w:type="spellEnd"/>
-      <w:r>
-        <w:t xml:space="preserve"> en el grupo con sobrepeso/obesidad tipo 2 destacan </w:t>
-      </w:r>
-      <w:r>
-        <w:rPr>
-          <w:i/>
-          <w:iCs/>
-        </w:rPr>
-        <w:t>FTO</w:t>
-      </w:r>
-      <w:r>
-        <w:t xml:space="preserve">, </w:t>
-      </w:r>
-      <w:r>
-        <w:rPr>
-          <w:i/>
-          <w:iCs/>
-        </w:rPr>
-        <w:t>SIM1</w:t>
-      </w:r>
-      <w:r>
-        <w:t xml:space="preserve">, </w:t>
-      </w:r>
-      <w:r>
-        <w:rPr>
-          <w:i/>
-          <w:iCs/>
-        </w:rPr>
-        <w:t>MC4R</w:t>
-      </w:r>
-      <w:r>
-        <w:t xml:space="preserve"> y </w:t>
-      </w:r>
-      <w:r>
-        <w:rPr>
-          <w:i/>
-          <w:iCs/>
-        </w:rPr>
-        <w:t>UBR2</w:t>
-      </w:r>
-      <w:r>
-        <w:t>, los cuales presentan valores positivos de log-</w:t>
-      </w:r>
-      <w:proofErr w:type="spellStart"/>
-      <w:r>
-        <w:t>fold</w:t>
-      </w:r>
-      <w:proofErr w:type="spellEnd"/>
-      <w:r>
-        <w:t xml:space="preserve"> </w:t>
-      </w:r>
-      <w:proofErr w:type="spellStart"/>
-      <w:r>
-        <w:t>change</w:t>
-      </w:r>
-      <w:proofErr w:type="spellEnd"/>
-      <w:r>
-        <w:t xml:space="preserve">, indicando un aumento de su expresión respecto al grupo </w:t>
-      </w:r>
-      <w:proofErr w:type="spellStart"/>
-      <w:r>
-        <w:t>normopeso</w:t>
-      </w:r>
-      <w:proofErr w:type="spellEnd"/>
-      <w:r>
-        <w:t>. Estos genes mantienen niveles de expresión promedio relativamente altos, lo que refuerza la robustez de los cambios observados.</w:t>
-      </w:r>
-      <w:r>
-        <w:t xml:space="preserve"> En este caso también vemos que UBR2 se queda por debajo del límite establecido aún ser estadísticamente significativo.  </w:t>
-      </w:r>
+      <w:pPr>
+        <w:jc w:val="both"/>
+      </w:pPr>
     </w:p>
-    <w:p>
-      <w:r>
-        <w:t xml:space="preserve">En contraste, </w:t>
-      </w:r>
-      <w:r>
-        <w:t xml:space="preserve">los </w:t>
-      </w:r>
-      <w:r>
-        <w:t xml:space="preserve">genes </w:t>
-      </w:r>
-      <w:r>
-        <w:rPr>
-          <w:i/>
-          <w:iCs/>
-        </w:rPr>
-        <w:t>NTRK2</w:t>
-      </w:r>
-      <w:r>
-        <w:t xml:space="preserve">, </w:t>
-      </w:r>
-      <w:r>
-        <w:rPr>
-          <w:i/>
-          <w:iCs/>
-        </w:rPr>
-        <w:t>LEP</w:t>
-      </w:r>
-      <w:r>
-        <w:t xml:space="preserve">, </w:t>
-      </w:r>
-      <w:r>
-        <w:rPr>
-          <w:i/>
-          <w:iCs/>
-        </w:rPr>
-        <w:t>BDNF</w:t>
-      </w:r>
-      <w:r>
-        <w:t xml:space="preserve">, </w:t>
-      </w:r>
-      <w:r>
-        <w:rPr>
-          <w:i/>
-          <w:iCs/>
-        </w:rPr>
-        <w:t>CADM2</w:t>
-      </w:r>
-      <w:r>
-        <w:t xml:space="preserve"> y </w:t>
-      </w:r>
-      <w:r>
-        <w:rPr>
-          <w:i/>
-          <w:iCs/>
-        </w:rPr>
-        <w:t>UHMK1</w:t>
-      </w:r>
-      <w:r>
-        <w:t xml:space="preserve"> aparecen como </w:t>
-      </w:r>
-      <w:proofErr w:type="spellStart"/>
-      <w:r>
-        <w:rPr>
-          <w:b/>
-          <w:bCs/>
-        </w:rPr>
-        <w:t>infraexpresados</w:t>
-      </w:r>
-      <w:proofErr w:type="spellEnd"/>
-      <w:r>
-        <w:t xml:space="preserve"> en el grupo con sobrepeso/obesidad, con valores negativos de log-</w:t>
-      </w:r>
-      <w:proofErr w:type="spellStart"/>
-      <w:r>
-        <w:t>fold</w:t>
-      </w:r>
-      <w:proofErr w:type="spellEnd"/>
-      <w:r>
-        <w:t xml:space="preserve"> </w:t>
-      </w:r>
-      <w:proofErr w:type="spellStart"/>
-      <w:r>
-        <w:t>change</w:t>
-      </w:r>
-      <w:proofErr w:type="spellEnd"/>
-      <w:r>
-        <w:t>. La disminución de su expresión es consistente a lo largo de diferentes niveles de expresión promedio, lo que sugiere que estos cambios no son producto de variaciones técnicas, sino de diferencias biológicas reales entre los grupos.</w:t>
-      </w:r>
-    </w:p>
-    <w:p>
-      <w:r>
-        <w:t xml:space="preserve">En general, el gráfico MA confirma los resultados observados en el gráfico </w:t>
-      </w:r>
-      <w:proofErr w:type="spellStart"/>
-      <w:r>
-        <w:t>volcano</w:t>
-      </w:r>
-      <w:proofErr w:type="spellEnd"/>
-      <w:r>
-        <w:t>, mostrando que un número reducido pero relevante de genes presenta cambios de expresión claros y reproducibles asociados al estado de sobrepeso/obesidad tipo 2.</w:t>
-      </w:r>
-    </w:p>
-    <w:p/>
     <w:sectPr>
       <w:pgSz w:w="11906" w:h="16838"/>
       <w:pgMar w:top="1417" w:right="1701" w:bottom="1417" w:left="1701" w:header="708" w:footer="708" w:gutter="0"/>
@@ -2412,7 +2534,7 @@
 </file>
 
 <file path=word/numbering.xml><?xml version="1.0" encoding="utf-8"?>
-<w:numbering xmlns:wpc="http://schemas.microsoft.com/office/word/2010/wordprocessingCanvas" xmlns:cx="http://schemas.microsoft.com/office/drawing/2014/chartex" xmlns:cx1="http://schemas.microsoft.com/office/drawing/2015/9/8/chartex" xmlns:cx2="http://schemas.microsoft.com/office/drawing/2015/10/21/chartex" xmlns:cx3="http://schemas.microsoft.com/office/drawing/2016/5/9/chartex" xmlns:cx4="http://schemas.microsoft.com/office/drawing/2016/5/10/chartex" xmlns:cx5="http://schemas.microsoft.com/office/drawing/2016/5/11/chartex" xmlns:cx6="http://schemas.microsoft.com/office/drawing/2016/5/12/chartex" xmlns:cx7="http://schemas.microsoft.com/office/drawing/2016/5/13/chartex" xmlns:cx8="http://schemas.microsoft.com/office/drawing/2016/5/14/chartex" xmlns:mc="http://schemas.openxmlformats.org/markup-compatibility/2006" xmlns:aink="http://schemas.microsoft.com/office/drawing/2016/ink" xmlns:am3d="http://schemas.microsoft.com/office/drawing/2017/model3d" xmlns:o="urn:schemas-microsoft-com:office:office" xmlns:oel="http://schemas.microsoft.com/office/2019/extlst" xmlns:r="http://schemas.openxmlformats.org/officeDocument/2006/relationships" xmlns:m="http://schemas.openxmlformats.org/officeDocument/2006/math" xmlns:v="urn:schemas-microsoft-com:vml" xmlns:wp14="http://schemas.microsoft.com/office/word/2010/wordprocessingDrawing" xmlns:wp="http://schemas.openxmlformats.org/drawingml/2006/wordprocessingDrawing" xmlns:w10="urn:schemas-microsoft-com:office:word" xmlns:w="http://schemas.openxmlformats.org/wordprocessingml/2006/main" xmlns:w14="http://schemas.microsoft.com/office/word/2010/wordml" xmlns:w15="http://schemas.microsoft.com/office/word/2012/wordml" xmlns:w16cex="http://schemas.microsoft.com/office/word/2018/wordml/cex" xmlns:w16cid="http://schemas.microsoft.com/office/word/2016/wordml/cid" xmlns:w16="http://schemas.microsoft.com/office/word/2018/wordml" xmlns:w16du="http://schemas.microsoft.com/office/word/2023/wordml/word16du" xmlns:w16sdtdh="http://schemas.microsoft.com/office/word/2020/wordml/sdtdatahash" xmlns:w16sdtfl="http://schemas.microsoft.com/office/word/2024/wordml/sdtformatlock" xmlns:w16se="http://schemas.microsoft.com/office/word/2015/wordml/symex" xmlns:wpg="http://schemas.microsoft.com/office/word/2010/wordprocessingGroup" xmlns:wpi="http://schemas.microsoft.com/office/word/2010/wordprocessingInk" xmlns:wne="http://schemas.microsoft.com/office/word/2006/wordml" xmlns:wps="http://schemas.microsoft.com/office/word/2010/wordprocessingShape" mc:Ignorable="w14 w15 w16se w16cid w16 w16cex w16sdtdh w16sdtfl w16du wp14">
+<w:numbering xmlns:wpc="http://schemas.microsoft.com/office/word/2010/wordprocessingCanvas" xmlns:cx="http://schemas.microsoft.com/office/drawing/2014/chartex" xmlns:cx1="http://schemas.microsoft.com/office/drawing/2015/9/8/chartex" xmlns:cx2="http://schemas.microsoft.com/office/drawing/2015/10/21/chartex" xmlns:cx3="http://schemas.microsoft.com/office/drawing/2016/5/9/chartex" xmlns:cx4="http://schemas.microsoft.com/office/drawing/2016/5/10/chartex" xmlns:cx5="http://schemas.microsoft.com/office/drawing/2016/5/11/chartex" xmlns:cx6="http://schemas.microsoft.com/office/drawing/2016/5/12/chartex" xmlns:cx7="http://schemas.microsoft.com/office/drawing/2016/5/13/chartex" xmlns:cx8="http://schemas.microsoft.com/office/drawing/2016/5/14/chartex" xmlns:mc="http://schemas.openxmlformats.org/markup-compatibility/2006" xmlns:aink="http://schemas.microsoft.com/office/drawing/2016/ink" xmlns:am3d="http://schemas.microsoft.com/office/drawing/2017/model3d" xmlns:o="urn:schemas-microsoft-com:office:office" xmlns:r="http://schemas.openxmlformats.org/officeDocument/2006/relationships" xmlns:m="http://schemas.openxmlformats.org/officeDocument/2006/math" xmlns:v="urn:schemas-microsoft-com:vml" xmlns:wp14="http://schemas.microsoft.com/office/word/2010/wordprocessingDrawing" xmlns:wp="http://schemas.openxmlformats.org/drawingml/2006/wordprocessingDrawing" xmlns:w10="urn:schemas-microsoft-com:office:word" xmlns:w="http://schemas.openxmlformats.org/wordprocessingml/2006/main" xmlns:w14="http://schemas.microsoft.com/office/word/2010/wordml" xmlns:w15="http://schemas.microsoft.com/office/word/2012/wordml" xmlns:w16cex="http://schemas.microsoft.com/office/word/2018/wordml/cex" xmlns:w16cid="http://schemas.microsoft.com/office/word/2016/wordml/cid" xmlns:w16="http://schemas.microsoft.com/office/word/2018/wordml" xmlns:w16se="http://schemas.microsoft.com/office/word/2015/wordml/symex" xmlns:wpg="http://schemas.microsoft.com/office/word/2010/wordprocessingGroup" xmlns:wpi="http://schemas.microsoft.com/office/word/2010/wordprocessingInk" xmlns:wne="http://schemas.microsoft.com/office/word/2006/wordml" xmlns:wps="http://schemas.microsoft.com/office/word/2010/wordprocessingShape" mc:Ignorable="w14 w15 w16se w16cid w16 w16cex wp14">
   <w:abstractNum w:abstractNumId="0" w15:restartNumberingAfterBreak="0">
     <w:nsid w:val="1BC4529E"/>
     <w:multiLevelType w:val="multilevel"/>
@@ -4761,59 +4883,59 @@
       </w:rPr>
     </w:lvl>
   </w:abstractNum>
-  <w:num w:numId="1" w16cid:durableId="2078480144">
+  <w:num w:numId="1">
     <w:abstractNumId w:val="9"/>
   </w:num>
-  <w:num w:numId="2" w16cid:durableId="1238244959">
+  <w:num w:numId="2">
     <w:abstractNumId w:val="12"/>
   </w:num>
-  <w:num w:numId="3" w16cid:durableId="1387027283">
+  <w:num w:numId="3">
     <w:abstractNumId w:val="2"/>
   </w:num>
-  <w:num w:numId="4" w16cid:durableId="873267746">
+  <w:num w:numId="4">
     <w:abstractNumId w:val="3"/>
   </w:num>
-  <w:num w:numId="5" w16cid:durableId="43793498">
+  <w:num w:numId="5">
     <w:abstractNumId w:val="14"/>
   </w:num>
-  <w:num w:numId="6" w16cid:durableId="388849493">
+  <w:num w:numId="6">
     <w:abstractNumId w:val="4"/>
   </w:num>
-  <w:num w:numId="7" w16cid:durableId="1169753430">
+  <w:num w:numId="7">
     <w:abstractNumId w:val="10"/>
   </w:num>
-  <w:num w:numId="8" w16cid:durableId="2057318632">
+  <w:num w:numId="8">
     <w:abstractNumId w:val="5"/>
   </w:num>
-  <w:num w:numId="9" w16cid:durableId="849444183">
+  <w:num w:numId="9">
     <w:abstractNumId w:val="13"/>
   </w:num>
-  <w:num w:numId="10" w16cid:durableId="1522813830">
+  <w:num w:numId="10">
     <w:abstractNumId w:val="6"/>
   </w:num>
-  <w:num w:numId="11" w16cid:durableId="806364454">
+  <w:num w:numId="11">
     <w:abstractNumId w:val="0"/>
   </w:num>
-  <w:num w:numId="12" w16cid:durableId="829096766">
+  <w:num w:numId="12">
     <w:abstractNumId w:val="7"/>
   </w:num>
-  <w:num w:numId="13" w16cid:durableId="947392323">
+  <w:num w:numId="13">
     <w:abstractNumId w:val="11"/>
   </w:num>
-  <w:num w:numId="14" w16cid:durableId="690765116">
+  <w:num w:numId="14">
     <w:abstractNumId w:val="1"/>
   </w:num>
-  <w:num w:numId="15" w16cid:durableId="1325820450">
+  <w:num w:numId="15">
     <w:abstractNumId w:val="8"/>
   </w:num>
-  <w:num w:numId="16" w16cid:durableId="747701579">
+  <w:num w:numId="16">
     <w:abstractNumId w:val="15"/>
   </w:num>
 </w:numbering>
 </file>
 
 <file path=word/styles.xml><?xml version="1.0" encoding="utf-8"?>
-<w:styles xmlns:mc="http://schemas.openxmlformats.org/markup-compatibility/2006" xmlns:r="http://schemas.openxmlformats.org/officeDocument/2006/relationships" xmlns:w="http://schemas.openxmlformats.org/wordprocessingml/2006/main" xmlns:w14="http://schemas.microsoft.com/office/word/2010/wordml" xmlns:w15="http://schemas.microsoft.com/office/word/2012/wordml" xmlns:w16cex="http://schemas.microsoft.com/office/word/2018/wordml/cex" xmlns:w16cid="http://schemas.microsoft.com/office/word/2016/wordml/cid" xmlns:w16="http://schemas.microsoft.com/office/word/2018/wordml" xmlns:w16du="http://schemas.microsoft.com/office/word/2023/wordml/word16du" xmlns:w16sdtdh="http://schemas.microsoft.com/office/word/2020/wordml/sdtdatahash" xmlns:w16sdtfl="http://schemas.microsoft.com/office/word/2024/wordml/sdtformatlock" xmlns:w16se="http://schemas.microsoft.com/office/word/2015/wordml/symex" mc:Ignorable="w14 w15 w16se w16cid w16 w16cex w16sdtdh w16sdtfl w16du">
+<w:styles xmlns:mc="http://schemas.openxmlformats.org/markup-compatibility/2006" xmlns:r="http://schemas.openxmlformats.org/officeDocument/2006/relationships" xmlns:w="http://schemas.openxmlformats.org/wordprocessingml/2006/main" xmlns:w14="http://schemas.microsoft.com/office/word/2010/wordml" xmlns:w15="http://schemas.microsoft.com/office/word/2012/wordml" xmlns:w16cex="http://schemas.microsoft.com/office/word/2018/wordml/cex" xmlns:w16cid="http://schemas.microsoft.com/office/word/2016/wordml/cid" xmlns:w16="http://schemas.microsoft.com/office/word/2018/wordml" xmlns:w16se="http://schemas.microsoft.com/office/word/2015/wordml/symex" mc:Ignorable="w14 w15 w16se w16cid w16 w16cex">
   <w:docDefaults>
     <w:rPrDefault>
       <w:rPr>
@@ -5413,6 +5535,7 @@
   <w:style w:type="character" w:default="1" w:styleId="Fuentedeprrafopredeter">
     <w:name w:val="Default Paragraph Font"/>
     <w:uiPriority w:val="1"/>
+    <w:semiHidden/>
     <w:unhideWhenUsed/>
   </w:style>
   <w:style w:type="table" w:default="1" w:styleId="Tablanormal">

</xml_diff>